<commit_message>
some fixes in отчет
</commit_message>
<xml_diff>
--- a/ОрловИЮ_P3114_ПРОГ_ЛР№5.docx
+++ b/ОрловИЮ_P3114_ПРОГ_ЛР№5.docx
@@ -498,7 +498,7 @@
           <w:sz w:val="28"/>
           <w:szCs w:val="28"/>
         </w:rPr>
-        <w:t>Бобрусь</w:t>
+        <w:t>Лазеев</w:t>
       </w:r>
       <w:proofErr w:type="spellEnd"/>
       <w:r>
@@ -506,7 +506,7 @@
           <w:sz w:val="28"/>
           <w:szCs w:val="28"/>
         </w:rPr>
-        <w:t xml:space="preserve"> Александр Владимирович</w:t>
+        <w:t xml:space="preserve"> Сергей Максимович</w:t>
       </w:r>
     </w:p>
     <w:p>
@@ -3157,6 +3157,9 @@
     </w:p>
     <w:p>
       <w:r>
+        <w:rPr>
+          <w:noProof/>
+        </w:rPr>
         <w:drawing>
           <wp:inline distT="0" distB="0" distL="0" distR="0" wp14:anchorId="13B6ACCA" wp14:editId="09D6C64F">
             <wp:extent cx="6645910" cy="1047115"/>
@@ -3376,7 +3379,7 @@
       <w:t>Санкт-Петербург, 202</w:t>
     </w:r>
     <w:r>
-      <w:t>5</w:t>
+      <w:t>6</w:t>
     </w:r>
   </w:p>
 </w:ftr>

</xml_diff>